<commit_message>
Version original:Cambio de formas
</commit_message>
<xml_diff>
--- a/Doc1 TAREA.docx
+++ b/Doc1 TAREA.docx
@@ -1009,7 +1009,7 @@
         </w:rPr>
         <w:lastRenderedPageBreak/>
         <w:drawing>
-          <wp:anchor distT="0" distB="0" distL="114300" distR="114300" simplePos="0" relativeHeight="251664384" behindDoc="0" locked="0" layoutInCell="1" allowOverlap="1" wp14:anchorId="028FFB72" wp14:editId="7D2909D4">
+          <wp:anchor distT="0" distB="0" distL="114300" distR="114300" simplePos="0" relativeHeight="251664384" behindDoc="0" locked="0" layoutInCell="1" allowOverlap="1" wp14:anchorId="028FFB72" wp14:editId="766CAE34">
             <wp:simplePos x="0" y="0"/>
             <wp:positionH relativeFrom="margin">
               <wp:align>right</wp:align>
@@ -2426,6 +2426,462 @@
         </a:p>
       </dgm:t>
     </dgm:pt>
+    <dgm:pt modelId="{BA7A90AA-CE2D-4DD2-BB59-0601334A7136}">
+      <dgm:prSet/>
+      <dgm:spPr/>
+      <dgm:t>
+        <a:bodyPr/>
+        <a:lstStyle/>
+        <a:p>
+          <a:r>
+            <a:rPr lang="es-BO"/>
+            <a:t>SEGUNDA INSTANCIA </a:t>
+          </a:r>
+        </a:p>
+        <a:p>
+          <a:r>
+            <a:rPr lang="es-BO"/>
+            <a:t>DIRECCION - JEFATURA DE CARRERA </a:t>
+          </a:r>
+        </a:p>
+        <a:p>
+          <a:r>
+            <a:rPr lang="es-BO"/>
+            <a:t>DIRIGIDA POR EL DIRECTOR FE LA CARRERA</a:t>
+          </a:r>
+        </a:p>
+      </dgm:t>
+    </dgm:pt>
+    <dgm:pt modelId="{62B140D0-DAB7-41C6-9CF9-936870D9C9D2}" type="parTrans" cxnId="{CBA66EA8-466D-4950-82E1-FC3AAF78F63D}">
+      <dgm:prSet/>
+      <dgm:spPr/>
+      <dgm:t>
+        <a:bodyPr/>
+        <a:lstStyle/>
+        <a:p>
+          <a:endParaRPr lang="es-BO"/>
+        </a:p>
+      </dgm:t>
+    </dgm:pt>
+    <dgm:pt modelId="{AAD85312-77AB-49A3-9CED-51A881114A55}" type="sibTrans" cxnId="{CBA66EA8-466D-4950-82E1-FC3AAF78F63D}">
+      <dgm:prSet/>
+      <dgm:spPr/>
+      <dgm:t>
+        <a:bodyPr/>
+        <a:lstStyle/>
+        <a:p>
+          <a:endParaRPr lang="es-BO"/>
+        </a:p>
+      </dgm:t>
+    </dgm:pt>
+    <dgm:pt modelId="{2104823F-D021-4F44-A3BF-F2ED7889FAA5}">
+      <dgm:prSet/>
+      <dgm:spPr/>
+      <dgm:t>
+        <a:bodyPr/>
+        <a:lstStyle/>
+        <a:p>
+          <a:r>
+            <a:rPr lang="es-BO"/>
+            <a:t>REPRESENTACION DEL ESTAMENTO ESTUDIANTIL</a:t>
+          </a:r>
+        </a:p>
+      </dgm:t>
+    </dgm:pt>
+    <dgm:pt modelId="{9F776FDB-BBF5-4864-9882-B03D56A5053B}" type="parTrans" cxnId="{8C047CCA-9903-47B3-8609-8688F42A1FB1}">
+      <dgm:prSet/>
+      <dgm:spPr/>
+      <dgm:t>
+        <a:bodyPr/>
+        <a:lstStyle/>
+        <a:p>
+          <a:endParaRPr lang="es-BO"/>
+        </a:p>
+      </dgm:t>
+    </dgm:pt>
+    <dgm:pt modelId="{18421FA9-86CB-47F5-90CA-0B900B5BD581}" type="sibTrans" cxnId="{8C047CCA-9903-47B3-8609-8688F42A1FB1}">
+      <dgm:prSet/>
+      <dgm:spPr/>
+      <dgm:t>
+        <a:bodyPr/>
+        <a:lstStyle/>
+        <a:p>
+          <a:endParaRPr lang="es-BO"/>
+        </a:p>
+      </dgm:t>
+    </dgm:pt>
+    <dgm:pt modelId="{6DE5CCA2-AD48-42DE-9A94-E359F5DC2511}">
+      <dgm:prSet/>
+      <dgm:spPr/>
+      <dgm:t>
+        <a:bodyPr/>
+        <a:lstStyle/>
+        <a:p>
+          <a:r>
+            <a:rPr lang="es-BO"/>
+            <a:t>PERSONAL OPERATIVO DE APOYO</a:t>
+          </a:r>
+        </a:p>
+      </dgm:t>
+    </dgm:pt>
+    <dgm:pt modelId="{847E2029-52CA-4FFB-BB4E-80B1F140C528}" type="parTrans" cxnId="{5488758F-A9C9-4ABF-A344-06876B1615DD}">
+      <dgm:prSet/>
+      <dgm:spPr/>
+      <dgm:t>
+        <a:bodyPr/>
+        <a:lstStyle/>
+        <a:p>
+          <a:endParaRPr lang="es-BO"/>
+        </a:p>
+      </dgm:t>
+    </dgm:pt>
+    <dgm:pt modelId="{0E72C9F0-A2E3-4473-B2A7-D94D2B87AE63}" type="sibTrans" cxnId="{5488758F-A9C9-4ABF-A344-06876B1615DD}">
+      <dgm:prSet/>
+      <dgm:spPr/>
+      <dgm:t>
+        <a:bodyPr/>
+        <a:lstStyle/>
+        <a:p>
+          <a:endParaRPr lang="es-BO"/>
+        </a:p>
+      </dgm:t>
+    </dgm:pt>
+    <dgm:pt modelId="{72B95F2D-12C6-4112-9D67-846AB281EB3A}" type="asst">
+      <dgm:prSet/>
+      <dgm:spPr/>
+      <dgm:t>
+        <a:bodyPr/>
+        <a:lstStyle/>
+        <a:p>
+          <a:r>
+            <a:rPr lang="es-BO"/>
+            <a:t>SECRETARIA DE DIRECCION</a:t>
+          </a:r>
+        </a:p>
+      </dgm:t>
+    </dgm:pt>
+    <dgm:pt modelId="{BCFA83A2-D3A6-4729-9E14-1F70135B9A0E}" type="parTrans" cxnId="{2B17A426-3C26-4FEC-A8B2-9BD6D1472042}">
+      <dgm:prSet/>
+      <dgm:spPr/>
+      <dgm:t>
+        <a:bodyPr/>
+        <a:lstStyle/>
+        <a:p>
+          <a:endParaRPr lang="es-BO"/>
+        </a:p>
+      </dgm:t>
+    </dgm:pt>
+    <dgm:pt modelId="{91A05F41-6DCE-4873-8788-1A48BBC1C510}" type="sibTrans" cxnId="{2B17A426-3C26-4FEC-A8B2-9BD6D1472042}">
+      <dgm:prSet/>
+      <dgm:spPr/>
+      <dgm:t>
+        <a:bodyPr/>
+        <a:lstStyle/>
+        <a:p>
+          <a:endParaRPr lang="es-BO"/>
+        </a:p>
+      </dgm:t>
+    </dgm:pt>
+    <dgm:pt modelId="{27B9171D-306A-457B-8D08-FAF5996FC4D8}">
+      <dgm:prSet/>
+      <dgm:spPr/>
+      <dgm:t>
+        <a:bodyPr/>
+        <a:lstStyle/>
+        <a:p>
+          <a:r>
+            <a:rPr lang="es-BO"/>
+            <a:t>SECRETARIO</a:t>
+          </a:r>
+        </a:p>
+      </dgm:t>
+    </dgm:pt>
+    <dgm:pt modelId="{BF52D4AB-1039-4099-BB4B-C66BB0087DEE}" type="parTrans" cxnId="{BCEBAA32-254C-477A-B533-B9BB52CE0D9A}">
+      <dgm:prSet/>
+      <dgm:spPr/>
+      <dgm:t>
+        <a:bodyPr/>
+        <a:lstStyle/>
+        <a:p>
+          <a:endParaRPr lang="es-BO"/>
+        </a:p>
+      </dgm:t>
+    </dgm:pt>
+    <dgm:pt modelId="{C048E0F4-4182-465D-8EA1-562F169A8461}" type="sibTrans" cxnId="{BCEBAA32-254C-477A-B533-B9BB52CE0D9A}">
+      <dgm:prSet/>
+      <dgm:spPr/>
+      <dgm:t>
+        <a:bodyPr/>
+        <a:lstStyle/>
+        <a:p>
+          <a:endParaRPr lang="es-BO"/>
+        </a:p>
+      </dgm:t>
+    </dgm:pt>
+    <dgm:pt modelId="{9AC9E9A5-3CDA-4236-AA94-BC6CE53E784E}">
+      <dgm:prSet/>
+      <dgm:spPr/>
+      <dgm:t>
+        <a:bodyPr/>
+        <a:lstStyle/>
+        <a:p>
+          <a:r>
+            <a:rPr lang="es-BO"/>
+            <a:t>AUXILIAR DE SECRETARIA</a:t>
+          </a:r>
+        </a:p>
+      </dgm:t>
+    </dgm:pt>
+    <dgm:pt modelId="{20C97729-7A73-4D99-BAD4-3CD6DFE83681}" type="parTrans" cxnId="{57A7CE74-6D32-423D-B9EF-1B156A2A819E}">
+      <dgm:prSet/>
+      <dgm:spPr/>
+      <dgm:t>
+        <a:bodyPr/>
+        <a:lstStyle/>
+        <a:p>
+          <a:endParaRPr lang="es-BO"/>
+        </a:p>
+      </dgm:t>
+    </dgm:pt>
+    <dgm:pt modelId="{C4990482-6935-43B6-AF06-C01F3C7D3203}" type="sibTrans" cxnId="{57A7CE74-6D32-423D-B9EF-1B156A2A819E}">
+      <dgm:prSet/>
+      <dgm:spPr/>
+      <dgm:t>
+        <a:bodyPr/>
+        <a:lstStyle/>
+        <a:p>
+          <a:endParaRPr lang="es-BO"/>
+        </a:p>
+      </dgm:t>
+    </dgm:pt>
+    <dgm:pt modelId="{AFFA11E5-ED30-493B-8052-891AE44ACF7B}">
+      <dgm:prSet/>
+      <dgm:spPr/>
+      <dgm:t>
+        <a:bodyPr/>
+        <a:lstStyle/>
+        <a:p>
+          <a:r>
+            <a:rPr lang="es-BO"/>
+            <a:t>JEFE DE LABORATORIOS </a:t>
+          </a:r>
+        </a:p>
+      </dgm:t>
+    </dgm:pt>
+    <dgm:pt modelId="{2C9800B1-8201-4C18-B88D-8E32C7B121D0}" type="parTrans" cxnId="{E25133F1-00B9-4847-9306-0D0C42840F82}">
+      <dgm:prSet/>
+      <dgm:spPr/>
+      <dgm:t>
+        <a:bodyPr/>
+        <a:lstStyle/>
+        <a:p>
+          <a:endParaRPr lang="es-BO"/>
+        </a:p>
+      </dgm:t>
+    </dgm:pt>
+    <dgm:pt modelId="{AF5BA373-A07C-4D38-8097-4DA8CDBEB314}" type="sibTrans" cxnId="{E25133F1-00B9-4847-9306-0D0C42840F82}">
+      <dgm:prSet/>
+      <dgm:spPr/>
+      <dgm:t>
+        <a:bodyPr/>
+        <a:lstStyle/>
+        <a:p>
+          <a:endParaRPr lang="es-BO"/>
+        </a:p>
+      </dgm:t>
+    </dgm:pt>
+    <dgm:pt modelId="{7A8A23A1-3F7B-48A5-8DAD-04177CCEAD6D}">
+      <dgm:prSet/>
+      <dgm:spPr/>
+      <dgm:t>
+        <a:bodyPr/>
+        <a:lstStyle/>
+        <a:p>
+          <a:r>
+            <a:rPr lang="es-BO"/>
+            <a:t>BECARIOS LABORANTES</a:t>
+          </a:r>
+        </a:p>
+      </dgm:t>
+    </dgm:pt>
+    <dgm:pt modelId="{8203B668-A75A-4BF9-8920-857D50D6F046}" type="parTrans" cxnId="{7D150DEF-9236-4637-B87A-0DC207E49D7A}">
+      <dgm:prSet/>
+      <dgm:spPr/>
+      <dgm:t>
+        <a:bodyPr/>
+        <a:lstStyle/>
+        <a:p>
+          <a:endParaRPr lang="es-BO"/>
+        </a:p>
+      </dgm:t>
+    </dgm:pt>
+    <dgm:pt modelId="{261259BC-AD41-42E2-9E51-96E1A0FBC21A}" type="sibTrans" cxnId="{7D150DEF-9236-4637-B87A-0DC207E49D7A}">
+      <dgm:prSet/>
+      <dgm:spPr/>
+      <dgm:t>
+        <a:bodyPr/>
+        <a:lstStyle/>
+        <a:p>
+          <a:endParaRPr lang="es-BO"/>
+        </a:p>
+      </dgm:t>
+    </dgm:pt>
+    <dgm:pt modelId="{FA633F5B-FD39-4EC0-8023-D81A4A4974DB}">
+      <dgm:prSet/>
+      <dgm:spPr/>
+      <dgm:t>
+        <a:bodyPr/>
+        <a:lstStyle/>
+        <a:p>
+          <a:r>
+            <a:rPr lang="es-BO"/>
+            <a:t>PERSONAKL DE LIMPIEZA</a:t>
+          </a:r>
+        </a:p>
+      </dgm:t>
+    </dgm:pt>
+    <dgm:pt modelId="{F0DE825F-22D3-4BA6-B6F1-19E802CE12B4}" type="parTrans" cxnId="{D2FE6800-117D-4E1D-A440-376E12E3C06B}">
+      <dgm:prSet/>
+      <dgm:spPr/>
+      <dgm:t>
+        <a:bodyPr/>
+        <a:lstStyle/>
+        <a:p>
+          <a:endParaRPr lang="es-BO"/>
+        </a:p>
+      </dgm:t>
+    </dgm:pt>
+    <dgm:pt modelId="{8DED463F-C78B-4533-9C21-9AD923E6B951}" type="sibTrans" cxnId="{D2FE6800-117D-4E1D-A440-376E12E3C06B}">
+      <dgm:prSet/>
+      <dgm:spPr/>
+      <dgm:t>
+        <a:bodyPr/>
+        <a:lstStyle/>
+        <a:p>
+          <a:endParaRPr lang="es-BO"/>
+        </a:p>
+      </dgm:t>
+    </dgm:pt>
+    <dgm:pt modelId="{051F2DA7-2A39-45BA-9414-02B023DCCA6C}">
+      <dgm:prSet/>
+      <dgm:spPr/>
+      <dgm:t>
+        <a:bodyPr/>
+        <a:lstStyle/>
+        <a:p>
+          <a:r>
+            <a:rPr lang="es-BO"/>
+            <a:t>LABORATORIOS</a:t>
+          </a:r>
+        </a:p>
+      </dgm:t>
+    </dgm:pt>
+    <dgm:pt modelId="{7426CAE4-E5BA-4A82-B79B-4BE59941F84E}" type="parTrans" cxnId="{2FE99698-B407-44C1-AE04-250706C7D125}">
+      <dgm:prSet/>
+      <dgm:spPr/>
+      <dgm:t>
+        <a:bodyPr/>
+        <a:lstStyle/>
+        <a:p>
+          <a:endParaRPr lang="es-BO"/>
+        </a:p>
+      </dgm:t>
+    </dgm:pt>
+    <dgm:pt modelId="{CF3DBCF5-B280-4A24-BBCC-11CADF608560}" type="sibTrans" cxnId="{2FE99698-B407-44C1-AE04-250706C7D125}">
+      <dgm:prSet/>
+      <dgm:spPr/>
+      <dgm:t>
+        <a:bodyPr/>
+        <a:lstStyle/>
+        <a:p>
+          <a:endParaRPr lang="es-BO"/>
+        </a:p>
+      </dgm:t>
+    </dgm:pt>
+    <dgm:pt modelId="{FCF90826-0E4D-4827-9DC4-C333C36200FF}">
+      <dgm:prSet/>
+      <dgm:spPr/>
+      <dgm:t>
+        <a:bodyPr/>
+        <a:lstStyle/>
+        <a:p>
+          <a:r>
+            <a:rPr lang="es-BO"/>
+            <a:t>ESTAMENTO ESTUDIANTIL </a:t>
+          </a:r>
+        </a:p>
+        <a:p>
+          <a:r>
+            <a:rPr lang="es-BO"/>
+            <a:t>ESTUDIANTES</a:t>
+          </a:r>
+        </a:p>
+      </dgm:t>
+    </dgm:pt>
+    <dgm:pt modelId="{515ECF54-27DB-4CD5-84F1-AD5DCB07E3F1}" type="parTrans" cxnId="{3BB8262B-83A0-4D86-9822-CC71C31B23AB}">
+      <dgm:prSet/>
+      <dgm:spPr/>
+      <dgm:t>
+        <a:bodyPr/>
+        <a:lstStyle/>
+        <a:p>
+          <a:endParaRPr lang="es-BO"/>
+        </a:p>
+      </dgm:t>
+    </dgm:pt>
+    <dgm:pt modelId="{F56698B1-C2E0-4C27-8C83-8502DDA43EB3}" type="sibTrans" cxnId="{3BB8262B-83A0-4D86-9822-CC71C31B23AB}">
+      <dgm:prSet/>
+      <dgm:spPr/>
+      <dgm:t>
+        <a:bodyPr/>
+        <a:lstStyle/>
+        <a:p>
+          <a:endParaRPr lang="es-BO"/>
+        </a:p>
+      </dgm:t>
+    </dgm:pt>
+    <dgm:pt modelId="{5B9C792B-52E9-4323-B33B-0E8F9860392E}">
+      <dgm:prSet/>
+      <dgm:spPr/>
+      <dgm:t>
+        <a:bodyPr/>
+        <a:lstStyle/>
+        <a:p>
+          <a:r>
+            <a:rPr lang="es-BO"/>
+            <a:t>PLANTEL DOCENTE</a:t>
+          </a:r>
+        </a:p>
+        <a:p>
+          <a:r>
+            <a:rPr lang="es-BO"/>
+            <a:t>DOCENTES</a:t>
+          </a:r>
+        </a:p>
+      </dgm:t>
+    </dgm:pt>
+    <dgm:pt modelId="{508E6E92-1A39-42D7-B2DC-34B37F2079C5}" type="parTrans" cxnId="{B01E8CF7-9A18-4342-B57D-7B8ED9F6153C}">
+      <dgm:prSet/>
+      <dgm:spPr/>
+      <dgm:t>
+        <a:bodyPr/>
+        <a:lstStyle/>
+        <a:p>
+          <a:endParaRPr lang="es-BO"/>
+        </a:p>
+      </dgm:t>
+    </dgm:pt>
+    <dgm:pt modelId="{824B44DE-51CC-4340-8F47-2C028E4D7649}" type="sibTrans" cxnId="{B01E8CF7-9A18-4342-B57D-7B8ED9F6153C}">
+      <dgm:prSet/>
+      <dgm:spPr/>
+      <dgm:t>
+        <a:bodyPr/>
+        <a:lstStyle/>
+        <a:p>
+          <a:endParaRPr lang="es-BO"/>
+        </a:p>
+      </dgm:t>
+    </dgm:pt>
     <dgm:pt modelId="{5483B523-6D1D-49E1-A350-6122058DD102}">
       <dgm:prSet custT="1"/>
       <dgm:spPr/>
@@ -2458,7 +2914,7 @@
         </a:p>
       </dgm:t>
     </dgm:pt>
-    <dgm:pt modelId="{A8A70996-FEC4-4980-9A8A-4A328976CEDF}" type="parTrans" cxnId="{A93B360C-5142-480E-9DEF-71E3016F648C}">
+    <dgm:pt modelId="{39C3E37B-442C-4F38-BF52-2EE97161F838}" type="sibTrans" cxnId="{A93B360C-5142-480E-9DEF-71E3016F648C}">
       <dgm:prSet/>
       <dgm:spPr/>
       <dgm:t>
@@ -2469,463 +2925,7 @@
         </a:p>
       </dgm:t>
     </dgm:pt>
-    <dgm:pt modelId="{39C3E37B-442C-4F38-BF52-2EE97161F838}" type="sibTrans" cxnId="{A93B360C-5142-480E-9DEF-71E3016F648C}">
-      <dgm:prSet/>
-      <dgm:spPr/>
-      <dgm:t>
-        <a:bodyPr/>
-        <a:lstStyle/>
-        <a:p>
-          <a:endParaRPr lang="es-BO"/>
-        </a:p>
-      </dgm:t>
-    </dgm:pt>
-    <dgm:pt modelId="{BA7A90AA-CE2D-4DD2-BB59-0601334A7136}">
-      <dgm:prSet/>
-      <dgm:spPr/>
-      <dgm:t>
-        <a:bodyPr/>
-        <a:lstStyle/>
-        <a:p>
-          <a:r>
-            <a:rPr lang="es-BO"/>
-            <a:t>SEGUNDA INSTANCIA </a:t>
-          </a:r>
-        </a:p>
-        <a:p>
-          <a:r>
-            <a:rPr lang="es-BO"/>
-            <a:t>DIRECCION - JEFATURA DE CARRERA </a:t>
-          </a:r>
-        </a:p>
-        <a:p>
-          <a:r>
-            <a:rPr lang="es-BO"/>
-            <a:t>DIRIGIDA POR EL DIRECTOR FE LA CARRERA</a:t>
-          </a:r>
-        </a:p>
-      </dgm:t>
-    </dgm:pt>
-    <dgm:pt modelId="{62B140D0-DAB7-41C6-9CF9-936870D9C9D2}" type="parTrans" cxnId="{CBA66EA8-466D-4950-82E1-FC3AAF78F63D}">
-      <dgm:prSet/>
-      <dgm:spPr/>
-      <dgm:t>
-        <a:bodyPr/>
-        <a:lstStyle/>
-        <a:p>
-          <a:endParaRPr lang="es-BO"/>
-        </a:p>
-      </dgm:t>
-    </dgm:pt>
-    <dgm:pt modelId="{AAD85312-77AB-49A3-9CED-51A881114A55}" type="sibTrans" cxnId="{CBA66EA8-466D-4950-82E1-FC3AAF78F63D}">
-      <dgm:prSet/>
-      <dgm:spPr/>
-      <dgm:t>
-        <a:bodyPr/>
-        <a:lstStyle/>
-        <a:p>
-          <a:endParaRPr lang="es-BO"/>
-        </a:p>
-      </dgm:t>
-    </dgm:pt>
-    <dgm:pt modelId="{2104823F-D021-4F44-A3BF-F2ED7889FAA5}">
-      <dgm:prSet/>
-      <dgm:spPr/>
-      <dgm:t>
-        <a:bodyPr/>
-        <a:lstStyle/>
-        <a:p>
-          <a:r>
-            <a:rPr lang="es-BO"/>
-            <a:t>REPRESENTACION DEL ESTAMENTO ESTUDIANTIL</a:t>
-          </a:r>
-        </a:p>
-      </dgm:t>
-    </dgm:pt>
-    <dgm:pt modelId="{9F776FDB-BBF5-4864-9882-B03D56A5053B}" type="parTrans" cxnId="{8C047CCA-9903-47B3-8609-8688F42A1FB1}">
-      <dgm:prSet/>
-      <dgm:spPr/>
-      <dgm:t>
-        <a:bodyPr/>
-        <a:lstStyle/>
-        <a:p>
-          <a:endParaRPr lang="es-BO"/>
-        </a:p>
-      </dgm:t>
-    </dgm:pt>
-    <dgm:pt modelId="{18421FA9-86CB-47F5-90CA-0B900B5BD581}" type="sibTrans" cxnId="{8C047CCA-9903-47B3-8609-8688F42A1FB1}">
-      <dgm:prSet/>
-      <dgm:spPr/>
-      <dgm:t>
-        <a:bodyPr/>
-        <a:lstStyle/>
-        <a:p>
-          <a:endParaRPr lang="es-BO"/>
-        </a:p>
-      </dgm:t>
-    </dgm:pt>
-    <dgm:pt modelId="{6DE5CCA2-AD48-42DE-9A94-E359F5DC2511}">
-      <dgm:prSet/>
-      <dgm:spPr/>
-      <dgm:t>
-        <a:bodyPr/>
-        <a:lstStyle/>
-        <a:p>
-          <a:r>
-            <a:rPr lang="es-BO"/>
-            <a:t>PERSONAL OPERATIVO DE APOYO</a:t>
-          </a:r>
-        </a:p>
-      </dgm:t>
-    </dgm:pt>
-    <dgm:pt modelId="{847E2029-52CA-4FFB-BB4E-80B1F140C528}" type="parTrans" cxnId="{5488758F-A9C9-4ABF-A344-06876B1615DD}">
-      <dgm:prSet/>
-      <dgm:spPr/>
-      <dgm:t>
-        <a:bodyPr/>
-        <a:lstStyle/>
-        <a:p>
-          <a:endParaRPr lang="es-BO"/>
-        </a:p>
-      </dgm:t>
-    </dgm:pt>
-    <dgm:pt modelId="{0E72C9F0-A2E3-4473-B2A7-D94D2B87AE63}" type="sibTrans" cxnId="{5488758F-A9C9-4ABF-A344-06876B1615DD}">
-      <dgm:prSet/>
-      <dgm:spPr/>
-      <dgm:t>
-        <a:bodyPr/>
-        <a:lstStyle/>
-        <a:p>
-          <a:endParaRPr lang="es-BO"/>
-        </a:p>
-      </dgm:t>
-    </dgm:pt>
-    <dgm:pt modelId="{72B95F2D-12C6-4112-9D67-846AB281EB3A}" type="asst">
-      <dgm:prSet/>
-      <dgm:spPr/>
-      <dgm:t>
-        <a:bodyPr/>
-        <a:lstStyle/>
-        <a:p>
-          <a:r>
-            <a:rPr lang="es-BO"/>
-            <a:t>SECRETARIA DE DIRECCION</a:t>
-          </a:r>
-        </a:p>
-      </dgm:t>
-    </dgm:pt>
-    <dgm:pt modelId="{BCFA83A2-D3A6-4729-9E14-1F70135B9A0E}" type="parTrans" cxnId="{2B17A426-3C26-4FEC-A8B2-9BD6D1472042}">
-      <dgm:prSet/>
-      <dgm:spPr/>
-      <dgm:t>
-        <a:bodyPr/>
-        <a:lstStyle/>
-        <a:p>
-          <a:endParaRPr lang="es-BO"/>
-        </a:p>
-      </dgm:t>
-    </dgm:pt>
-    <dgm:pt modelId="{91A05F41-6DCE-4873-8788-1A48BBC1C510}" type="sibTrans" cxnId="{2B17A426-3C26-4FEC-A8B2-9BD6D1472042}">
-      <dgm:prSet/>
-      <dgm:spPr/>
-      <dgm:t>
-        <a:bodyPr/>
-        <a:lstStyle/>
-        <a:p>
-          <a:endParaRPr lang="es-BO"/>
-        </a:p>
-      </dgm:t>
-    </dgm:pt>
-    <dgm:pt modelId="{27B9171D-306A-457B-8D08-FAF5996FC4D8}">
-      <dgm:prSet/>
-      <dgm:spPr/>
-      <dgm:t>
-        <a:bodyPr/>
-        <a:lstStyle/>
-        <a:p>
-          <a:r>
-            <a:rPr lang="es-BO"/>
-            <a:t>SECRETARIO</a:t>
-          </a:r>
-        </a:p>
-      </dgm:t>
-    </dgm:pt>
-    <dgm:pt modelId="{BF52D4AB-1039-4099-BB4B-C66BB0087DEE}" type="parTrans" cxnId="{BCEBAA32-254C-477A-B533-B9BB52CE0D9A}">
-      <dgm:prSet/>
-      <dgm:spPr/>
-      <dgm:t>
-        <a:bodyPr/>
-        <a:lstStyle/>
-        <a:p>
-          <a:endParaRPr lang="es-BO"/>
-        </a:p>
-      </dgm:t>
-    </dgm:pt>
-    <dgm:pt modelId="{C048E0F4-4182-465D-8EA1-562F169A8461}" type="sibTrans" cxnId="{BCEBAA32-254C-477A-B533-B9BB52CE0D9A}">
-      <dgm:prSet/>
-      <dgm:spPr/>
-      <dgm:t>
-        <a:bodyPr/>
-        <a:lstStyle/>
-        <a:p>
-          <a:endParaRPr lang="es-BO"/>
-        </a:p>
-      </dgm:t>
-    </dgm:pt>
-    <dgm:pt modelId="{9AC9E9A5-3CDA-4236-AA94-BC6CE53E784E}">
-      <dgm:prSet/>
-      <dgm:spPr/>
-      <dgm:t>
-        <a:bodyPr/>
-        <a:lstStyle/>
-        <a:p>
-          <a:r>
-            <a:rPr lang="es-BO"/>
-            <a:t>AUXILIAR DE SECRETARIA</a:t>
-          </a:r>
-        </a:p>
-      </dgm:t>
-    </dgm:pt>
-    <dgm:pt modelId="{20C97729-7A73-4D99-BAD4-3CD6DFE83681}" type="parTrans" cxnId="{57A7CE74-6D32-423D-B9EF-1B156A2A819E}">
-      <dgm:prSet/>
-      <dgm:spPr/>
-      <dgm:t>
-        <a:bodyPr/>
-        <a:lstStyle/>
-        <a:p>
-          <a:endParaRPr lang="es-BO"/>
-        </a:p>
-      </dgm:t>
-    </dgm:pt>
-    <dgm:pt modelId="{C4990482-6935-43B6-AF06-C01F3C7D3203}" type="sibTrans" cxnId="{57A7CE74-6D32-423D-B9EF-1B156A2A819E}">
-      <dgm:prSet/>
-      <dgm:spPr/>
-      <dgm:t>
-        <a:bodyPr/>
-        <a:lstStyle/>
-        <a:p>
-          <a:endParaRPr lang="es-BO"/>
-        </a:p>
-      </dgm:t>
-    </dgm:pt>
-    <dgm:pt modelId="{AFFA11E5-ED30-493B-8052-891AE44ACF7B}">
-      <dgm:prSet/>
-      <dgm:spPr/>
-      <dgm:t>
-        <a:bodyPr/>
-        <a:lstStyle/>
-        <a:p>
-          <a:r>
-            <a:rPr lang="es-BO"/>
-            <a:t>JEFE DE LABORATORIOS </a:t>
-          </a:r>
-        </a:p>
-      </dgm:t>
-    </dgm:pt>
-    <dgm:pt modelId="{2C9800B1-8201-4C18-B88D-8E32C7B121D0}" type="parTrans" cxnId="{E25133F1-00B9-4847-9306-0D0C42840F82}">
-      <dgm:prSet/>
-      <dgm:spPr/>
-      <dgm:t>
-        <a:bodyPr/>
-        <a:lstStyle/>
-        <a:p>
-          <a:endParaRPr lang="es-BO"/>
-        </a:p>
-      </dgm:t>
-    </dgm:pt>
-    <dgm:pt modelId="{AF5BA373-A07C-4D38-8097-4DA8CDBEB314}" type="sibTrans" cxnId="{E25133F1-00B9-4847-9306-0D0C42840F82}">
-      <dgm:prSet/>
-      <dgm:spPr/>
-      <dgm:t>
-        <a:bodyPr/>
-        <a:lstStyle/>
-        <a:p>
-          <a:endParaRPr lang="es-BO"/>
-        </a:p>
-      </dgm:t>
-    </dgm:pt>
-    <dgm:pt modelId="{7A8A23A1-3F7B-48A5-8DAD-04177CCEAD6D}">
-      <dgm:prSet/>
-      <dgm:spPr/>
-      <dgm:t>
-        <a:bodyPr/>
-        <a:lstStyle/>
-        <a:p>
-          <a:r>
-            <a:rPr lang="es-BO"/>
-            <a:t>BECARIOS LABORANTES</a:t>
-          </a:r>
-        </a:p>
-      </dgm:t>
-    </dgm:pt>
-    <dgm:pt modelId="{8203B668-A75A-4BF9-8920-857D50D6F046}" type="parTrans" cxnId="{7D150DEF-9236-4637-B87A-0DC207E49D7A}">
-      <dgm:prSet/>
-      <dgm:spPr/>
-      <dgm:t>
-        <a:bodyPr/>
-        <a:lstStyle/>
-        <a:p>
-          <a:endParaRPr lang="es-BO"/>
-        </a:p>
-      </dgm:t>
-    </dgm:pt>
-    <dgm:pt modelId="{261259BC-AD41-42E2-9E51-96E1A0FBC21A}" type="sibTrans" cxnId="{7D150DEF-9236-4637-B87A-0DC207E49D7A}">
-      <dgm:prSet/>
-      <dgm:spPr/>
-      <dgm:t>
-        <a:bodyPr/>
-        <a:lstStyle/>
-        <a:p>
-          <a:endParaRPr lang="es-BO"/>
-        </a:p>
-      </dgm:t>
-    </dgm:pt>
-    <dgm:pt modelId="{FA633F5B-FD39-4EC0-8023-D81A4A4974DB}">
-      <dgm:prSet/>
-      <dgm:spPr/>
-      <dgm:t>
-        <a:bodyPr/>
-        <a:lstStyle/>
-        <a:p>
-          <a:r>
-            <a:rPr lang="es-BO"/>
-            <a:t>PERSONAKL DE LIMPIEZA</a:t>
-          </a:r>
-        </a:p>
-      </dgm:t>
-    </dgm:pt>
-    <dgm:pt modelId="{F0DE825F-22D3-4BA6-B6F1-19E802CE12B4}" type="parTrans" cxnId="{D2FE6800-117D-4E1D-A440-376E12E3C06B}">
-      <dgm:prSet/>
-      <dgm:spPr/>
-      <dgm:t>
-        <a:bodyPr/>
-        <a:lstStyle/>
-        <a:p>
-          <a:endParaRPr lang="es-BO"/>
-        </a:p>
-      </dgm:t>
-    </dgm:pt>
-    <dgm:pt modelId="{8DED463F-C78B-4533-9C21-9AD923E6B951}" type="sibTrans" cxnId="{D2FE6800-117D-4E1D-A440-376E12E3C06B}">
-      <dgm:prSet/>
-      <dgm:spPr/>
-      <dgm:t>
-        <a:bodyPr/>
-        <a:lstStyle/>
-        <a:p>
-          <a:endParaRPr lang="es-BO"/>
-        </a:p>
-      </dgm:t>
-    </dgm:pt>
-    <dgm:pt modelId="{051F2DA7-2A39-45BA-9414-02B023DCCA6C}">
-      <dgm:prSet/>
-      <dgm:spPr/>
-      <dgm:t>
-        <a:bodyPr/>
-        <a:lstStyle/>
-        <a:p>
-          <a:r>
-            <a:rPr lang="es-BO"/>
-            <a:t>LABORATORIOS</a:t>
-          </a:r>
-        </a:p>
-      </dgm:t>
-    </dgm:pt>
-    <dgm:pt modelId="{7426CAE4-E5BA-4A82-B79B-4BE59941F84E}" type="parTrans" cxnId="{2FE99698-B407-44C1-AE04-250706C7D125}">
-      <dgm:prSet/>
-      <dgm:spPr/>
-      <dgm:t>
-        <a:bodyPr/>
-        <a:lstStyle/>
-        <a:p>
-          <a:endParaRPr lang="es-BO"/>
-        </a:p>
-      </dgm:t>
-    </dgm:pt>
-    <dgm:pt modelId="{CF3DBCF5-B280-4A24-BBCC-11CADF608560}" type="sibTrans" cxnId="{2FE99698-B407-44C1-AE04-250706C7D125}">
-      <dgm:prSet/>
-      <dgm:spPr/>
-      <dgm:t>
-        <a:bodyPr/>
-        <a:lstStyle/>
-        <a:p>
-          <a:endParaRPr lang="es-BO"/>
-        </a:p>
-      </dgm:t>
-    </dgm:pt>
-    <dgm:pt modelId="{FCF90826-0E4D-4827-9DC4-C333C36200FF}">
-      <dgm:prSet/>
-      <dgm:spPr/>
-      <dgm:t>
-        <a:bodyPr/>
-        <a:lstStyle/>
-        <a:p>
-          <a:r>
-            <a:rPr lang="es-BO"/>
-            <a:t>ESTAMENTO ESTUDIANTIL </a:t>
-          </a:r>
-        </a:p>
-        <a:p>
-          <a:r>
-            <a:rPr lang="es-BO"/>
-            <a:t>ESTUDIANTES</a:t>
-          </a:r>
-        </a:p>
-      </dgm:t>
-    </dgm:pt>
-    <dgm:pt modelId="{515ECF54-27DB-4CD5-84F1-AD5DCB07E3F1}" type="parTrans" cxnId="{3BB8262B-83A0-4D86-9822-CC71C31B23AB}">
-      <dgm:prSet/>
-      <dgm:spPr/>
-      <dgm:t>
-        <a:bodyPr/>
-        <a:lstStyle/>
-        <a:p>
-          <a:endParaRPr lang="es-BO"/>
-        </a:p>
-      </dgm:t>
-    </dgm:pt>
-    <dgm:pt modelId="{F56698B1-C2E0-4C27-8C83-8502DDA43EB3}" type="sibTrans" cxnId="{3BB8262B-83A0-4D86-9822-CC71C31B23AB}">
-      <dgm:prSet/>
-      <dgm:spPr/>
-      <dgm:t>
-        <a:bodyPr/>
-        <a:lstStyle/>
-        <a:p>
-          <a:endParaRPr lang="es-BO"/>
-        </a:p>
-      </dgm:t>
-    </dgm:pt>
-    <dgm:pt modelId="{5B9C792B-52E9-4323-B33B-0E8F9860392E}">
-      <dgm:prSet/>
-      <dgm:spPr/>
-      <dgm:t>
-        <a:bodyPr/>
-        <a:lstStyle/>
-        <a:p>
-          <a:r>
-            <a:rPr lang="es-BO"/>
-            <a:t>PLANTEL DOCENTE</a:t>
-          </a:r>
-        </a:p>
-        <a:p>
-          <a:r>
-            <a:rPr lang="es-BO"/>
-            <a:t>DOCENTES</a:t>
-          </a:r>
-        </a:p>
-      </dgm:t>
-    </dgm:pt>
-    <dgm:pt modelId="{508E6E92-1A39-42D7-B2DC-34B37F2079C5}" type="parTrans" cxnId="{B01E8CF7-9A18-4342-B57D-7B8ED9F6153C}">
-      <dgm:prSet/>
-      <dgm:spPr/>
-      <dgm:t>
-        <a:bodyPr/>
-        <a:lstStyle/>
-        <a:p>
-          <a:endParaRPr lang="es-BO"/>
-        </a:p>
-      </dgm:t>
-    </dgm:pt>
-    <dgm:pt modelId="{824B44DE-51CC-4340-8F47-2C028E4D7649}" type="sibTrans" cxnId="{B01E8CF7-9A18-4342-B57D-7B8ED9F6153C}">
+    <dgm:pt modelId="{A8A70996-FEC4-4980-9A8A-4A328976CEDF}" type="parTrans" cxnId="{A93B360C-5142-480E-9DEF-71E3016F648C}">
       <dgm:prSet/>
       <dgm:spPr/>
       <dgm:t>

</xml_diff>

<commit_message>
Vercion actualizada: cambios en Doc1 TAREA
</commit_message>
<xml_diff>
--- a/Doc1 TAREA.docx
+++ b/Doc1 TAREA.docx
@@ -1009,7 +1009,7 @@
         </w:rPr>
         <w:lastRenderedPageBreak/>
         <w:drawing>
-          <wp:anchor distT="0" distB="0" distL="114300" distR="114300" simplePos="0" relativeHeight="251664384" behindDoc="0" locked="0" layoutInCell="1" allowOverlap="1" wp14:anchorId="028FFB72" wp14:editId="766CAE34">
+          <wp:anchor distT="0" distB="0" distL="114300" distR="114300" simplePos="0" relativeHeight="251664384" behindDoc="0" locked="0" layoutInCell="1" allowOverlap="1" wp14:anchorId="028FFB72" wp14:editId="1071BF6D">
             <wp:simplePos x="0" y="0"/>
             <wp:positionH relativeFrom="margin">
               <wp:align>right</wp:align>
@@ -1018,7 +1018,7 @@
               <wp:posOffset>580390</wp:posOffset>
             </wp:positionV>
             <wp:extent cx="8953500" cy="5849620"/>
-            <wp:effectExtent l="57150" t="0" r="38100" b="0"/>
+            <wp:effectExtent l="57150" t="0" r="19050" b="0"/>
             <wp:wrapTopAndBottom/>
             <wp:docPr id="125093013" name="Diagrama 2"/>
             <wp:cNvGraphicFramePr/>
@@ -2967,7 +2967,11 @@
           <dgm:chPref val="3"/>
         </dgm:presLayoutVars>
       </dgm:prSet>
-      <dgm:spPr/>
+      <dgm:spPr>
+        <a:prstGeom prst="ellipse">
+          <a:avLst/>
+        </a:prstGeom>
+      </dgm:spPr>
     </dgm:pt>
     <dgm:pt modelId="{A551134F-B98F-43D8-902F-D78B8222E2B8}" type="pres">
       <dgm:prSet presAssocID="{5483B523-6D1D-49E1-A350-6122058DD102}" presName="rootConnector1" presStyleLbl="node1" presStyleIdx="0" presStyleCnt="0"/>
@@ -2999,7 +3003,11 @@
           <dgm:chPref val="3"/>
         </dgm:presLayoutVars>
       </dgm:prSet>
-      <dgm:spPr/>
+      <dgm:spPr>
+        <a:prstGeom prst="ellipse">
+          <a:avLst/>
+        </a:prstGeom>
+      </dgm:spPr>
     </dgm:pt>
     <dgm:pt modelId="{C6316B1F-A37A-4E8B-9692-D9EE7F448D89}" type="pres">
       <dgm:prSet presAssocID="{71BD7F64-085E-4CD7-B9C3-0413F30D6F37}" presName="rootConnector" presStyleLbl="node2" presStyleIdx="0" presStyleCnt="3"/>
@@ -3071,7 +3079,11 @@
           <dgm:chPref val="3"/>
         </dgm:presLayoutVars>
       </dgm:prSet>
-      <dgm:spPr/>
+      <dgm:spPr>
+        <a:prstGeom prst="ellipse">
+          <a:avLst/>
+        </a:prstGeom>
+      </dgm:spPr>
     </dgm:pt>
     <dgm:pt modelId="{56FF4E28-2322-4C5C-9E05-AF6F3A996063}" type="pres">
       <dgm:prSet presAssocID="{BA7A90AA-CE2D-4DD2-BB59-0601334A7136}" presName="rootConnector" presStyleLbl="node2" presStyleIdx="1" presStyleCnt="3"/>
@@ -3395,7 +3407,11 @@
           <dgm:chPref val="3"/>
         </dgm:presLayoutVars>
       </dgm:prSet>
-      <dgm:spPr/>
+      <dgm:spPr>
+        <a:prstGeom prst="ellipse">
+          <a:avLst/>
+        </a:prstGeom>
+      </dgm:spPr>
     </dgm:pt>
     <dgm:pt modelId="{EB109B33-8A84-4664-A676-277451CDE916}" type="pres">
       <dgm:prSet presAssocID="{2104823F-D021-4F44-A3BF-F2ED7889FAA5}" presName="rootConnector" presStyleLbl="node2" presStyleIdx="2" presStyleCnt="3"/>
@@ -4470,7 +4486,7 @@
           <a:off x="3295189" y="132305"/>
           <a:ext cx="3628918" cy="1020562"/>
         </a:xfrm>
-        <a:prstGeom prst="rect">
+        <a:prstGeom prst="ellipse">
           <a:avLst/>
         </a:prstGeom>
         <a:gradFill rotWithShape="0">
@@ -4617,8 +4633,8 @@
         </a:p>
       </dsp:txBody>
       <dsp:txXfrm>
-        <a:off x="3295189" y="132305"/>
-        <a:ext cx="3628918" cy="1020562"/>
+        <a:off x="3826632" y="281763"/>
+        <a:ext cx="2566032" cy="721646"/>
       </dsp:txXfrm>
     </dsp:sp>
     <dsp:sp modelId="{5ACB1B9D-F5D1-4D21-947A-5BADAC8CD6C8}">
@@ -4631,7 +4647,7 @@
           <a:off x="717957" y="1224026"/>
           <a:ext cx="1214967" cy="846221"/>
         </a:xfrm>
-        <a:prstGeom prst="rect">
+        <a:prstGeom prst="ellipse">
           <a:avLst/>
         </a:prstGeom>
         <a:gradFill rotWithShape="0">
@@ -4700,12 +4716,12 @@
         </a:fontRef>
       </dsp:style>
       <dsp:txBody>
-        <a:bodyPr spcFirstLastPara="0" vert="horz" wrap="square" lIns="5080" tIns="5080" rIns="5080" bIns="5080" numCol="1" spcCol="1270" anchor="ctr" anchorCtr="0">
+        <a:bodyPr spcFirstLastPara="0" vert="horz" wrap="square" lIns="4445" tIns="4445" rIns="4445" bIns="4445" numCol="1" spcCol="1270" anchor="ctr" anchorCtr="0">
           <a:noAutofit/>
         </a:bodyPr>
         <a:lstStyle/>
         <a:p>
-          <a:pPr marL="0" lvl="0" indent="0" algn="ctr" defTabSz="355600">
+          <a:pPr marL="0" lvl="0" indent="0" algn="ctr" defTabSz="311150">
             <a:lnSpc>
               <a:spcPct val="90000"/>
             </a:lnSpc>
@@ -4718,14 +4734,14 @@
             <a:buNone/>
           </a:pPr>
           <a:r>
-            <a:rPr lang="es-BO" sz="800" kern="1200"/>
+            <a:rPr lang="es-BO" sz="700" kern="1200"/>
             <a:t>REPRESENTACION DEL PLANTEL DOCENTE</a:t>
           </a:r>
         </a:p>
       </dsp:txBody>
       <dsp:txXfrm>
-        <a:off x="717957" y="1224026"/>
-        <a:ext cx="1214967" cy="846221"/>
+        <a:off x="895885" y="1347952"/>
+        <a:ext cx="859111" cy="598369"/>
       </dsp:txXfrm>
     </dsp:sp>
     <dsp:sp modelId="{0B1B76EA-B519-4939-9820-7F8690BCA634}">
@@ -4807,12 +4823,12 @@
         </a:fontRef>
       </dsp:style>
       <dsp:txBody>
-        <a:bodyPr spcFirstLastPara="0" vert="horz" wrap="square" lIns="5080" tIns="5080" rIns="5080" bIns="5080" numCol="1" spcCol="1270" anchor="ctr" anchorCtr="0">
+        <a:bodyPr spcFirstLastPara="0" vert="horz" wrap="square" lIns="4445" tIns="4445" rIns="4445" bIns="4445" numCol="1" spcCol="1270" anchor="ctr" anchorCtr="0">
           <a:noAutofit/>
         </a:bodyPr>
         <a:lstStyle/>
         <a:p>
-          <a:pPr marL="0" lvl="0" indent="0" algn="ctr" defTabSz="355600">
+          <a:pPr marL="0" lvl="0" indent="0" algn="ctr" defTabSz="311150">
             <a:lnSpc>
               <a:spcPct val="90000"/>
             </a:lnSpc>
@@ -4825,12 +4841,12 @@
             <a:buNone/>
           </a:pPr>
           <a:r>
-            <a:rPr lang="es-BO" sz="800" kern="1200"/>
+            <a:rPr lang="es-BO" sz="700" kern="1200"/>
             <a:t>PLANTEL DOCENTE</a:t>
           </a:r>
         </a:p>
         <a:p>
-          <a:pPr marL="0" lvl="0" indent="0" algn="ctr" defTabSz="355600">
+          <a:pPr marL="0" lvl="0" indent="0" algn="ctr" defTabSz="311150">
             <a:lnSpc>
               <a:spcPct val="90000"/>
             </a:lnSpc>
@@ -4843,7 +4859,7 @@
             <a:buNone/>
           </a:pPr>
           <a:r>
-            <a:rPr lang="es-BO" sz="800" kern="1200"/>
+            <a:rPr lang="es-BO" sz="700" kern="1200"/>
             <a:t>DOCENTES</a:t>
           </a:r>
         </a:p>
@@ -4863,7 +4879,7 @@
           <a:off x="3252902" y="1760791"/>
           <a:ext cx="1498731" cy="834896"/>
         </a:xfrm>
-        <a:prstGeom prst="rect">
+        <a:prstGeom prst="ellipse">
           <a:avLst/>
         </a:prstGeom>
         <a:gradFill rotWithShape="0">
@@ -4932,12 +4948,12 @@
         </a:fontRef>
       </dsp:style>
       <dsp:txBody>
-        <a:bodyPr spcFirstLastPara="0" vert="horz" wrap="square" lIns="5080" tIns="5080" rIns="5080" bIns="5080" numCol="1" spcCol="1270" anchor="ctr" anchorCtr="0">
+        <a:bodyPr spcFirstLastPara="0" vert="horz" wrap="square" lIns="4445" tIns="4445" rIns="4445" bIns="4445" numCol="1" spcCol="1270" anchor="ctr" anchorCtr="0">
           <a:noAutofit/>
         </a:bodyPr>
         <a:lstStyle/>
         <a:p>
-          <a:pPr marL="0" lvl="0" indent="0" algn="ctr" defTabSz="355600">
+          <a:pPr marL="0" lvl="0" indent="0" algn="ctr" defTabSz="311150">
             <a:lnSpc>
               <a:spcPct val="90000"/>
             </a:lnSpc>
@@ -4950,12 +4966,12 @@
             <a:buNone/>
           </a:pPr>
           <a:r>
-            <a:rPr lang="es-BO" sz="800" kern="1200"/>
+            <a:rPr lang="es-BO" sz="700" kern="1200"/>
             <a:t>SEGUNDA INSTANCIA </a:t>
           </a:r>
         </a:p>
         <a:p>
-          <a:pPr marL="0" lvl="0" indent="0" algn="ctr" defTabSz="355600">
+          <a:pPr marL="0" lvl="0" indent="0" algn="ctr" defTabSz="311150">
             <a:lnSpc>
               <a:spcPct val="90000"/>
             </a:lnSpc>
@@ -4968,12 +4984,12 @@
             <a:buNone/>
           </a:pPr>
           <a:r>
-            <a:rPr lang="es-BO" sz="800" kern="1200"/>
+            <a:rPr lang="es-BO" sz="700" kern="1200"/>
             <a:t>DIRECCION - JEFATURA DE CARRERA </a:t>
           </a:r>
         </a:p>
         <a:p>
-          <a:pPr marL="0" lvl="0" indent="0" algn="ctr" defTabSz="355600">
+          <a:pPr marL="0" lvl="0" indent="0" algn="ctr" defTabSz="311150">
             <a:lnSpc>
               <a:spcPct val="90000"/>
             </a:lnSpc>
@@ -4986,14 +5002,14 @@
             <a:buNone/>
           </a:pPr>
           <a:r>
-            <a:rPr lang="es-BO" sz="800" kern="1200"/>
+            <a:rPr lang="es-BO" sz="700" kern="1200"/>
             <a:t>DIRIGIDA POR EL DIRECTOR FE LA CARRERA</a:t>
           </a:r>
         </a:p>
       </dsp:txBody>
       <dsp:txXfrm>
-        <a:off x="3252902" y="1760791"/>
-        <a:ext cx="1498731" cy="834896"/>
+        <a:off x="3472386" y="1883059"/>
+        <a:ext cx="1059763" cy="590360"/>
       </dsp:txXfrm>
     </dsp:sp>
     <dsp:sp modelId="{EDB3C612-63CE-46AC-A102-B2552AB28202}">
@@ -5075,12 +5091,12 @@
         </a:fontRef>
       </dsp:style>
       <dsp:txBody>
-        <a:bodyPr spcFirstLastPara="0" vert="horz" wrap="square" lIns="5080" tIns="5080" rIns="5080" bIns="5080" numCol="1" spcCol="1270" anchor="ctr" anchorCtr="0">
+        <a:bodyPr spcFirstLastPara="0" vert="horz" wrap="square" lIns="4445" tIns="4445" rIns="4445" bIns="4445" numCol="1" spcCol="1270" anchor="ctr" anchorCtr="0">
           <a:noAutofit/>
         </a:bodyPr>
         <a:lstStyle/>
         <a:p>
-          <a:pPr marL="0" lvl="0" indent="0" algn="ctr" defTabSz="355600">
+          <a:pPr marL="0" lvl="0" indent="0" algn="ctr" defTabSz="311150">
             <a:lnSpc>
               <a:spcPct val="90000"/>
             </a:lnSpc>
@@ -5093,7 +5109,7 @@
             <a:buNone/>
           </a:pPr>
           <a:r>
-            <a:rPr lang="es-BO" sz="800" kern="1200"/>
+            <a:rPr lang="es-BO" sz="700" kern="1200"/>
             <a:t>PERSONAL OPERATIVO DE APOYO</a:t>
           </a:r>
         </a:p>
@@ -5182,12 +5198,12 @@
         </a:fontRef>
       </dsp:style>
       <dsp:txBody>
-        <a:bodyPr spcFirstLastPara="0" vert="horz" wrap="square" lIns="5080" tIns="5080" rIns="5080" bIns="5080" numCol="1" spcCol="1270" anchor="ctr" anchorCtr="0">
+        <a:bodyPr spcFirstLastPara="0" vert="horz" wrap="square" lIns="4445" tIns="4445" rIns="4445" bIns="4445" numCol="1" spcCol="1270" anchor="ctr" anchorCtr="0">
           <a:noAutofit/>
         </a:bodyPr>
         <a:lstStyle/>
         <a:p>
-          <a:pPr marL="0" lvl="0" indent="0" algn="ctr" defTabSz="355600">
+          <a:pPr marL="0" lvl="0" indent="0" algn="ctr" defTabSz="311150">
             <a:lnSpc>
               <a:spcPct val="90000"/>
             </a:lnSpc>
@@ -5200,7 +5216,7 @@
             <a:buNone/>
           </a:pPr>
           <a:r>
-            <a:rPr lang="es-BO" sz="800" kern="1200"/>
+            <a:rPr lang="es-BO" sz="700" kern="1200"/>
             <a:t>JEFE DE LABORATORIOS </a:t>
           </a:r>
         </a:p>
@@ -5289,12 +5305,12 @@
         </a:fontRef>
       </dsp:style>
       <dsp:txBody>
-        <a:bodyPr spcFirstLastPara="0" vert="horz" wrap="square" lIns="5080" tIns="5080" rIns="5080" bIns="5080" numCol="1" spcCol="1270" anchor="ctr" anchorCtr="0">
+        <a:bodyPr spcFirstLastPara="0" vert="horz" wrap="square" lIns="4445" tIns="4445" rIns="4445" bIns="4445" numCol="1" spcCol="1270" anchor="ctr" anchorCtr="0">
           <a:noAutofit/>
         </a:bodyPr>
         <a:lstStyle/>
         <a:p>
-          <a:pPr marL="0" lvl="0" indent="0" algn="ctr" defTabSz="355600">
+          <a:pPr marL="0" lvl="0" indent="0" algn="ctr" defTabSz="311150">
             <a:lnSpc>
               <a:spcPct val="90000"/>
             </a:lnSpc>
@@ -5307,7 +5323,7 @@
             <a:buNone/>
           </a:pPr>
           <a:r>
-            <a:rPr lang="es-BO" sz="800" kern="1200"/>
+            <a:rPr lang="es-BO" sz="700" kern="1200"/>
             <a:t>BECARIOS LABORANTES</a:t>
           </a:r>
         </a:p>
@@ -5396,12 +5412,12 @@
         </a:fontRef>
       </dsp:style>
       <dsp:txBody>
-        <a:bodyPr spcFirstLastPara="0" vert="horz" wrap="square" lIns="5080" tIns="5080" rIns="5080" bIns="5080" numCol="1" spcCol="1270" anchor="ctr" anchorCtr="0">
+        <a:bodyPr spcFirstLastPara="0" vert="horz" wrap="square" lIns="4445" tIns="4445" rIns="4445" bIns="4445" numCol="1" spcCol="1270" anchor="ctr" anchorCtr="0">
           <a:noAutofit/>
         </a:bodyPr>
         <a:lstStyle/>
         <a:p>
-          <a:pPr marL="0" lvl="0" indent="0" algn="ctr" defTabSz="355600">
+          <a:pPr marL="0" lvl="0" indent="0" algn="ctr" defTabSz="311150">
             <a:lnSpc>
               <a:spcPct val="90000"/>
             </a:lnSpc>
@@ -5414,7 +5430,7 @@
             <a:buNone/>
           </a:pPr>
           <a:r>
-            <a:rPr lang="es-BO" sz="800" kern="1200"/>
+            <a:rPr lang="es-BO" sz="700" kern="1200"/>
             <a:t>PERSONAKL DE LIMPIEZA</a:t>
           </a:r>
         </a:p>
@@ -5503,12 +5519,12 @@
         </a:fontRef>
       </dsp:style>
       <dsp:txBody>
-        <a:bodyPr spcFirstLastPara="0" vert="horz" wrap="square" lIns="5080" tIns="5080" rIns="5080" bIns="5080" numCol="1" spcCol="1270" anchor="ctr" anchorCtr="0">
+        <a:bodyPr spcFirstLastPara="0" vert="horz" wrap="square" lIns="4445" tIns="4445" rIns="4445" bIns="4445" numCol="1" spcCol="1270" anchor="ctr" anchorCtr="0">
           <a:noAutofit/>
         </a:bodyPr>
         <a:lstStyle/>
         <a:p>
-          <a:pPr marL="0" lvl="0" indent="0" algn="ctr" defTabSz="355600">
+          <a:pPr marL="0" lvl="0" indent="0" algn="ctr" defTabSz="311150">
             <a:lnSpc>
               <a:spcPct val="90000"/>
             </a:lnSpc>
@@ -5521,7 +5537,7 @@
             <a:buNone/>
           </a:pPr>
           <a:r>
-            <a:rPr lang="es-BO" sz="800" kern="1200"/>
+            <a:rPr lang="es-BO" sz="700" kern="1200"/>
             <a:t>LABORATORIOS</a:t>
           </a:r>
         </a:p>
@@ -5610,12 +5626,12 @@
         </a:fontRef>
       </dsp:style>
       <dsp:txBody>
-        <a:bodyPr spcFirstLastPara="0" vert="horz" wrap="square" lIns="5080" tIns="5080" rIns="5080" bIns="5080" numCol="1" spcCol="1270" anchor="ctr" anchorCtr="0">
+        <a:bodyPr spcFirstLastPara="0" vert="horz" wrap="square" lIns="4445" tIns="4445" rIns="4445" bIns="4445" numCol="1" spcCol="1270" anchor="ctr" anchorCtr="0">
           <a:noAutofit/>
         </a:bodyPr>
         <a:lstStyle/>
         <a:p>
-          <a:pPr marL="0" lvl="0" indent="0" algn="ctr" defTabSz="355600">
+          <a:pPr marL="0" lvl="0" indent="0" algn="ctr" defTabSz="311150">
             <a:lnSpc>
               <a:spcPct val="90000"/>
             </a:lnSpc>
@@ -5628,7 +5644,7 @@
             <a:buNone/>
           </a:pPr>
           <a:r>
-            <a:rPr lang="es-BO" sz="800" kern="1200"/>
+            <a:rPr lang="es-BO" sz="700" kern="1200"/>
             <a:t>SECRETARIA DE DIRECCION</a:t>
           </a:r>
         </a:p>
@@ -5717,12 +5733,12 @@
         </a:fontRef>
       </dsp:style>
       <dsp:txBody>
-        <a:bodyPr spcFirstLastPara="0" vert="horz" wrap="square" lIns="5080" tIns="5080" rIns="5080" bIns="5080" numCol="1" spcCol="1270" anchor="ctr" anchorCtr="0">
+        <a:bodyPr spcFirstLastPara="0" vert="horz" wrap="square" lIns="4445" tIns="4445" rIns="4445" bIns="4445" numCol="1" spcCol="1270" anchor="ctr" anchorCtr="0">
           <a:noAutofit/>
         </a:bodyPr>
         <a:lstStyle/>
         <a:p>
-          <a:pPr marL="0" lvl="0" indent="0" algn="ctr" defTabSz="355600">
+          <a:pPr marL="0" lvl="0" indent="0" algn="ctr" defTabSz="311150">
             <a:lnSpc>
               <a:spcPct val="90000"/>
             </a:lnSpc>
@@ -5735,7 +5751,7 @@
             <a:buNone/>
           </a:pPr>
           <a:r>
-            <a:rPr lang="es-BO" sz="800" kern="1200"/>
+            <a:rPr lang="es-BO" sz="700" kern="1200"/>
             <a:t>SECRETARIO</a:t>
           </a:r>
         </a:p>
@@ -5824,12 +5840,12 @@
         </a:fontRef>
       </dsp:style>
       <dsp:txBody>
-        <a:bodyPr spcFirstLastPara="0" vert="horz" wrap="square" lIns="5080" tIns="5080" rIns="5080" bIns="5080" numCol="1" spcCol="1270" anchor="ctr" anchorCtr="0">
+        <a:bodyPr spcFirstLastPara="0" vert="horz" wrap="square" lIns="4445" tIns="4445" rIns="4445" bIns="4445" numCol="1" spcCol="1270" anchor="ctr" anchorCtr="0">
           <a:noAutofit/>
         </a:bodyPr>
         <a:lstStyle/>
         <a:p>
-          <a:pPr marL="0" lvl="0" indent="0" algn="ctr" defTabSz="355600">
+          <a:pPr marL="0" lvl="0" indent="0" algn="ctr" defTabSz="311150">
             <a:lnSpc>
               <a:spcPct val="90000"/>
             </a:lnSpc>
@@ -5842,7 +5858,7 @@
             <a:buNone/>
           </a:pPr>
           <a:r>
-            <a:rPr lang="es-BO" sz="800" kern="1200"/>
+            <a:rPr lang="es-BO" sz="700" kern="1200"/>
             <a:t>AUXILIAR DE SECRETARIA</a:t>
           </a:r>
         </a:p>
@@ -5862,7 +5878,7 @@
           <a:off x="6708232" y="1375057"/>
           <a:ext cx="2245267" cy="403027"/>
         </a:xfrm>
-        <a:prstGeom prst="rect">
+        <a:prstGeom prst="ellipse">
           <a:avLst/>
         </a:prstGeom>
         <a:gradFill rotWithShape="0">
@@ -5931,12 +5947,12 @@
         </a:fontRef>
       </dsp:style>
       <dsp:txBody>
-        <a:bodyPr spcFirstLastPara="0" vert="horz" wrap="square" lIns="5080" tIns="5080" rIns="5080" bIns="5080" numCol="1" spcCol="1270" anchor="ctr" anchorCtr="0">
+        <a:bodyPr spcFirstLastPara="0" vert="horz" wrap="square" lIns="4445" tIns="4445" rIns="4445" bIns="4445" numCol="1" spcCol="1270" anchor="ctr" anchorCtr="0">
           <a:noAutofit/>
         </a:bodyPr>
         <a:lstStyle/>
         <a:p>
-          <a:pPr marL="0" lvl="0" indent="0" algn="ctr" defTabSz="355600">
+          <a:pPr marL="0" lvl="0" indent="0" algn="ctr" defTabSz="311150">
             <a:lnSpc>
               <a:spcPct val="90000"/>
             </a:lnSpc>
@@ -5949,14 +5965,14 @@
             <a:buNone/>
           </a:pPr>
           <a:r>
-            <a:rPr lang="es-BO" sz="800" kern="1200"/>
+            <a:rPr lang="es-BO" sz="700" kern="1200"/>
             <a:t>REPRESENTACION DEL ESTAMENTO ESTUDIANTIL</a:t>
           </a:r>
         </a:p>
       </dsp:txBody>
       <dsp:txXfrm>
-        <a:off x="6708232" y="1375057"/>
-        <a:ext cx="2245267" cy="403027"/>
+        <a:off x="7037044" y="1434079"/>
+        <a:ext cx="1587643" cy="284983"/>
       </dsp:txXfrm>
     </dsp:sp>
     <dsp:sp modelId="{79145E80-5CDF-4D74-AF27-158101E8760D}">
@@ -6038,12 +6054,12 @@
         </a:fontRef>
       </dsp:style>
       <dsp:txBody>
-        <a:bodyPr spcFirstLastPara="0" vert="horz" wrap="square" lIns="5080" tIns="5080" rIns="5080" bIns="5080" numCol="1" spcCol="1270" anchor="ctr" anchorCtr="0">
+        <a:bodyPr spcFirstLastPara="0" vert="horz" wrap="square" lIns="4445" tIns="4445" rIns="4445" bIns="4445" numCol="1" spcCol="1270" anchor="ctr" anchorCtr="0">
           <a:noAutofit/>
         </a:bodyPr>
         <a:lstStyle/>
         <a:p>
-          <a:pPr marL="0" lvl="0" indent="0" algn="ctr" defTabSz="355600">
+          <a:pPr marL="0" lvl="0" indent="0" algn="ctr" defTabSz="311150">
             <a:lnSpc>
               <a:spcPct val="90000"/>
             </a:lnSpc>
@@ -6056,12 +6072,12 @@
             <a:buNone/>
           </a:pPr>
           <a:r>
-            <a:rPr lang="es-BO" sz="800" kern="1200"/>
+            <a:rPr lang="es-BO" sz="700" kern="1200"/>
             <a:t>ESTAMENTO ESTUDIANTIL </a:t>
           </a:r>
         </a:p>
         <a:p>
-          <a:pPr marL="0" lvl="0" indent="0" algn="ctr" defTabSz="355600">
+          <a:pPr marL="0" lvl="0" indent="0" algn="ctr" defTabSz="311150">
             <a:lnSpc>
               <a:spcPct val="90000"/>
             </a:lnSpc>
@@ -6074,7 +6090,7 @@
             <a:buNone/>
           </a:pPr>
           <a:r>
-            <a:rPr lang="es-BO" sz="800" kern="1200"/>
+            <a:rPr lang="es-BO" sz="700" kern="1200"/>
             <a:t>ESTUDIANTES</a:t>
           </a:r>
         </a:p>

</xml_diff>